<commit_message>
Lock FY SEO audit to operator strategy
Homepage stays the Miami ranker, Panama stays its own city page, and every page/city is allowed to rank on its own. Phones and hub pricing are out of scope; review counts move to a shortcode ticket.

Co-authored-by: feelingyachty-cpu <feelingyachty-cpu@users.noreply.github.com>
</commit_message>
<xml_diff>
--- a/docs/seo/audits/Feeling-Yachty-SEO-Framework-Audit-2026-08-14.docx
+++ b/docs/seo/audits/Feeling-Yachty-SEO-Framework-Audit-2026-08-14.docx
@@ -86,6 +86,204 @@
           <w:rFonts w:ascii="Calibri" w:hAnsi="Calibri"/>
           <w:color w:val="C49200"/>
         </w:rPr>
+        <w:t>0. Operator lock (Fernando, 14 August 2026)</w:t>
+      </w:r>
+    </w:p>
+    <w:p>
+      <w:pPr>
+        <w:spacing w:after="160" w:before="0" w:line="276" w:lineRule="auto"/>
+      </w:pPr>
+      <w:r>
+        <w:rPr>
+          <w:rFonts w:ascii="Calibri" w:hAnsi="Calibri" w:eastAsia="Calibri"/>
+          <w:b/>
+          <w:i w:val="0"/>
+          <w:color w:val="14160F"/>
+          <w:sz w:val="22"/>
+        </w:rPr>
+        <w:t>This lock supersedes the first-pass “merge the Miami hubs / rewrite the homepage as a brand roof / unify phones” reading. The Excel CHANGE_QUEUE is the working system. Do not reopen the items below.</w:t>
+      </w:r>
+    </w:p>
+    <w:p>
+      <w:pPr>
+        <w:pStyle w:val="ListBullet"/>
+        <w:spacing w:after="80"/>
+      </w:pPr>
+      <w:r>
+        <w:rPr>
+          <w:rFonts w:ascii="Calibri" w:hAnsi="Calibri" w:eastAsia="Calibri"/>
+          <w:b/>
+          <w:i w:val="0"/>
+          <w:color w:val="14160F"/>
+          <w:sz w:val="22"/>
+        </w:rPr>
+        <w:t>Miami home.</w:t>
+      </w:r>
+      <w:r>
+        <w:rPr>
+          <w:rFonts w:ascii="Calibri" w:hAnsi="Calibri" w:eastAsia="Calibri"/>
+          <w:b w:val="0"/>
+          <w:i w:val="0"/>
+          <w:color w:val="14160F"/>
+          <w:sz w:val="22"/>
+        </w:rPr>
+        <w:t xml:space="preserve"> Homepage H1 “Miami Yacht Rental” stays. The homepage is what ranks most for Miami. Do not move Miami off /.</w:t>
+      </w:r>
+    </w:p>
+    <w:p>
+      <w:pPr>
+        <w:pStyle w:val="ListBullet"/>
+        <w:spacing w:after="80"/>
+      </w:pPr>
+      <w:r>
+        <w:rPr>
+          <w:rFonts w:ascii="Calibri" w:hAnsi="Calibri" w:eastAsia="Calibri"/>
+          <w:b/>
+          <w:i w:val="0"/>
+          <w:color w:val="14160F"/>
+          <w:sz w:val="22"/>
+        </w:rPr>
+        <w:t>Panama hub.</w:t>
+      </w:r>
+      <w:r>
+        <w:rPr>
+          <w:rFonts w:ascii="Calibri" w:hAnsi="Calibri" w:eastAsia="Calibri"/>
+          <w:b w:val="0"/>
+          <w:i w:val="0"/>
+          <w:color w:val="14160F"/>
+          <w:sz w:val="22"/>
+        </w:rPr>
+        <w:t xml:space="preserve"> /panama-yacht-rentals/ already ranks in Panama. It stays its own city money page. Do not merge Panama into the homepage.</w:t>
+      </w:r>
+    </w:p>
+    <w:p>
+      <w:pPr>
+        <w:pStyle w:val="ListBullet"/>
+        <w:spacing w:after="80"/>
+      </w:pPr>
+      <w:r>
+        <w:rPr>
+          <w:rFonts w:ascii="Calibri" w:hAnsi="Calibri" w:eastAsia="Calibri"/>
+          <w:b/>
+          <w:i w:val="0"/>
+          <w:color w:val="14160F"/>
+          <w:sz w:val="22"/>
+        </w:rPr>
+        <w:t>Own-page ranking.</w:t>
+      </w:r>
+      <w:r>
+        <w:rPr>
+          <w:rFonts w:ascii="Calibri" w:hAnsi="Calibri" w:eastAsia="Calibri"/>
+          <w:b w:val="0"/>
+          <w:i w:val="0"/>
+          <w:color w:val="14160F"/>
+          <w:sz w:val="22"/>
+        </w:rPr>
+        <w:t xml:space="preserve"> Every page and every city is allowed to rank on its own. Do not 301 Miami hubs together (charters, cheap, affordable, luxury, directory, capacity pages).</w:t>
+      </w:r>
+    </w:p>
+    <w:p>
+      <w:pPr>
+        <w:pStyle w:val="ListBullet"/>
+        <w:spacing w:after="80"/>
+      </w:pPr>
+      <w:r>
+        <w:rPr>
+          <w:rFonts w:ascii="Calibri" w:hAnsi="Calibri" w:eastAsia="Calibri"/>
+          <w:b/>
+          <w:i w:val="0"/>
+          <w:color w:val="14160F"/>
+          <w:sz w:val="22"/>
+        </w:rPr>
+        <w:t>Reviews.</w:t>
+      </w:r>
+      <w:r>
+        <w:rPr>
+          <w:rFonts w:ascii="Calibri" w:hAnsi="Calibri" w:eastAsia="Calibri"/>
+          <w:b w:val="0"/>
+          <w:i w:val="0"/>
+          <w:color w:val="14160F"/>
+          <w:sz w:val="22"/>
+        </w:rPr>
+        <w:t xml:space="preserve"> Review integers are stale because the brand grew. Operator will add shortcodes so one edit updates every template (Excel CHG-011).</w:t>
+      </w:r>
+    </w:p>
+    <w:p>
+      <w:pPr>
+        <w:pStyle w:val="ListBullet"/>
+        <w:spacing w:after="80"/>
+      </w:pPr>
+      <w:r>
+        <w:rPr>
+          <w:rFonts w:ascii="Calibri" w:hAnsi="Calibri" w:eastAsia="Calibri"/>
+          <w:b/>
+          <w:i w:val="0"/>
+          <w:color w:val="14160F"/>
+          <w:sz w:val="22"/>
+        </w:rPr>
+        <w:t>Phones.</w:t>
+      </w:r>
+      <w:r>
+        <w:rPr>
+          <w:rFonts w:ascii="Calibri" w:hAnsi="Calibri" w:eastAsia="Calibri"/>
+          <w:b w:val="0"/>
+          <w:i w:val="0"/>
+          <w:color w:val="14160F"/>
+          <w:sz w:val="22"/>
+        </w:rPr>
+        <w:t xml:space="preserve"> Some numbers are for Panama pages and some are for Miami pages. That is intentional. Do not unify NAP.</w:t>
+      </w:r>
+    </w:p>
+    <w:p>
+      <w:pPr>
+        <w:pStyle w:val="ListBullet"/>
+        <w:spacing w:after="80"/>
+      </w:pPr>
+      <w:r>
+        <w:rPr>
+          <w:rFonts w:ascii="Calibri" w:hAnsi="Calibri" w:eastAsia="Calibri"/>
+          <w:b/>
+          <w:i w:val="0"/>
+          <w:color w:val="14160F"/>
+          <w:sz w:val="22"/>
+        </w:rPr>
+        <w:t>Hub / pricing.</w:t>
+      </w:r>
+      <w:r>
+        <w:rPr>
+          <w:rFonts w:ascii="Calibri" w:hAnsi="Calibri" w:eastAsia="Calibri"/>
+          <w:b w:val="0"/>
+          <w:i w:val="0"/>
+          <w:color w:val="14160F"/>
+          <w:sz w:val="22"/>
+        </w:rPr>
+        <w:t xml:space="preserve"> Inventory widget vs listing prices, inclusions copy, Fendi hub-vs-listing — out of scope. Do not ticket.</w:t>
+      </w:r>
+    </w:p>
+    <w:p>
+      <w:pPr>
+        <w:spacing w:after="160" w:before="0" w:line="276" w:lineRule="auto"/>
+      </w:pPr>
+      <w:r>
+        <w:rPr>
+          <w:rFonts w:ascii="Calibri" w:hAnsi="Calibri" w:eastAsia="Calibri"/>
+          <w:b w:val="0"/>
+          <w:i w:val="0"/>
+          <w:color w:val="14160F"/>
+          <w:sz w:val="22"/>
+        </w:rPr>
+        <w:t>What remains a ticket: indexed junk; a URL whose live H1 is a different city or entity than the slug; a URL that collapses to another template (so it is not ranking on its own); orphan/404 listing links; Panama assets in a Miami folder; thin TEST tips.</w:t>
+      </w:r>
+    </w:p>
+    <w:p>
+      <w:pPr>
+        <w:pStyle w:val="Heading1"/>
+      </w:pPr>
+      <w:r>
+        <w:rPr>
+          <w:rFonts w:ascii="Calibri" w:hAnsi="Calibri"/>
+          <w:color w:val="C49200"/>
+        </w:rPr>
         <w:t>1. Verdict</w:t>
       </w:r>
     </w:p>
@@ -101,7 +299,7 @@
           <w:color w:val="14160F"/>
           <w:sz w:val="22"/>
         </w:rPr>
-        <w:t>The site is a strong commercial catalog that is a weak semantic content network. Feeling Yachty already has the hard parts of charter SEO: real inventory, visible prices, WhatsApp and GHL booking paths, reviews, and two real destinations. The Koray / Tongberg framework would fail the site on the next test: one source context, one owner URL per query cluster, consistent facts, and a map that does not drown money pages in near-duplicates.</w:t>
+        <w:t>The site is a strong commercial catalog. Feeling Yachty already has the hard parts of charter SEO: real inventory, visible prices, WhatsApp and GHL booking paths, reviews, and two real destinations that each have a ranking URL. Under the operator lock, the next test is not “one owner per cluster.” It is: can every page and every city rank on its own, with an H1 that matches the slug, and without junk or collapsed aliases in the way.</w:t>
       </w:r>
     </w:p>
     <w:p>
@@ -116,7 +314,7 @@
           <w:color w:val="14160F"/>
           <w:sz w:val="22"/>
         </w:rPr>
-        <w:t>In plain language: Google (and a guest) has to work too hard to decide which URL is “the” Miami yacht charter page, which phone is real, whether fuel is included, and whether this brand is Miami-only or Miami + Panama. That is cost of retrieval. That is the opposite of topical authority.</w:t>
+        <w:t>In plain language under the operator lock: home is the Miami ranker, Panama is its own ranker, and every other city/page is allowed to rank too. Cost of retrieval now is a URL that cannot rank for itself — wrong-city H1, collapsed alias, or indexed junk — not “too many Miami hubs.”</w:t>
       </w:r>
     </w:p>
     <w:tbl>
@@ -223,7 +421,7 @@
                 <w:color w:val="14160F"/>
                 <w:sz w:val="20"/>
               </w:rPr>
-              <w:t>2 / 5</w:t>
+              <w:t>4 / 5</w:t>
             </w:r>
           </w:p>
         </w:tc>
@@ -241,7 +439,7 @@
                 <w:color w:val="14160F"/>
                 <w:sz w:val="20"/>
               </w:rPr>
-              <w:t>Homepage H1 is Miami Yacht Rental. Panama is a footnote. Brand is not the roof.</w:t>
+              <w:t>Operator lock: homepage is the Miami ranker. Panama is its own ranking URL. That is the intended two-city map.</w:t>
             </w:r>
           </w:p>
         </w:tc>
@@ -335,7 +533,7 @@
                 <w:color w:val="14160F"/>
                 <w:sz w:val="20"/>
               </w:rPr>
-              <w:t>2 / 5</w:t>
+              <w:t>3 / 5</w:t>
             </w:r>
           </w:p>
         </w:tc>
@@ -353,7 +551,7 @@
                 <w:color w:val="14160F"/>
                 <w:sz w:val="20"/>
               </w:rPr>
-              <w:t>Hubs repeat the same inventory widget instead of owning one job.</w:t>
+              <w:t>Hubs share a widget (out of scope). Remaining issue is unique H1/first passage per query.</w:t>
             </w:r>
           </w:p>
         </w:tc>
@@ -521,7 +719,7 @@
                 <w:color w:val="14160F"/>
                 <w:sz w:val="20"/>
               </w:rPr>
-              <w:t>Many folders, same boats, weak ownership. Tips often loop to the same hub.</w:t>
+              <w:t>Many folders, same boats. Orphan /miami-yacht-rental/{boat}/ links are still a ticket.</w:t>
             </w:r>
           </w:p>
         </w:tc>
@@ -541,7 +739,7 @@
                 <w:color w:val="14160F"/>
                 <w:sz w:val="20"/>
               </w:rPr>
-              <w:t>Cannibalization safety</w:t>
+              <w:t>Own-page ranking</w:t>
             </w:r>
           </w:p>
         </w:tc>
@@ -559,7 +757,7 @@
                 <w:color w:val="14160F"/>
                 <w:sz w:val="20"/>
               </w:rPr>
-              <w:t>1 / 5</w:t>
+              <w:t>2 / 5</w:t>
             </w:r>
           </w:p>
         </w:tc>
@@ -577,7 +775,7 @@
                 <w:color w:val="14160F"/>
                 <w:sz w:val="20"/>
               </w:rPr>
-              <w:t>Home, /miami-yacht-rental/, /miami-yacht-charters/, cheap, affordable, luxury…</w:t>
+              <w:t>Specials/deals/rentals-plural collapse to another template. FTL/destinations/sales/reviews H1s are the wrong entity.</w:t>
             </w:r>
           </w:p>
         </w:tc>
@@ -597,7 +795,7 @@
                 <w:color w:val="14160F"/>
                 <w:sz w:val="20"/>
               </w:rPr>
-              <w:t>Trust / identity / NAP</w:t>
+              <w:t>Trust / identity</w:t>
             </w:r>
           </w:p>
         </w:tc>
@@ -615,7 +813,7 @@
                 <w:color w:val="14160F"/>
                 <w:sz w:val="20"/>
               </w:rPr>
-              <w:t>1 / 5</w:t>
+              <w:t>3 / 5</w:t>
             </w:r>
           </w:p>
         </w:tc>
@@ -633,7 +831,7 @@
                 <w:color w:val="14160F"/>
                 <w:sz w:val="20"/>
               </w:rPr>
-              <w:t>Phones, review counts, inclusions, and city labels contradict each other.</w:t>
+              <w:t>City phones intentional. Review integers move to shortcodes. Hub pricing out of scope.</w:t>
             </w:r>
           </w:p>
         </w:tc>
@@ -652,7 +850,7 @@
           <w:color w:val="14160F"/>
           <w:sz w:val="22"/>
         </w:rPr>
-        <w:t>Overall: 2.3 / 5 against the PACMAN Koray bar. Fix contradictions and ownership before publishing more tips. More nodes will make this worse.</w:t>
+        <w:t>Overall (operator-adjusted): strategy is locked. Remaining work is subtraction of junk, un-collapsing aliases, and making each slug’s live H1 match the city/query it is supposed to rank for. Do not merge hubs. Do not rewrite the homepage off Miami.</w:t>
       </w:r>
     </w:p>
     <w:p>
@@ -787,7 +985,7 @@
           <w:rFonts w:ascii="Calibri" w:hAnsi="Calibri"/>
           <w:color w:val="C49200"/>
         </w:rPr>
-        <w:t>3. Source context — the first failure</w:t>
+        <w:t>3. Source context — operator-locked map</w:t>
       </w:r>
     </w:p>
     <w:p>
@@ -802,7 +1000,7 @@
           <w:color w:val="14160F"/>
           <w:sz w:val="22"/>
         </w:rPr>
-        <w:t>Koray’s first rule: lock source context. Feeling Yachty’s operating truth (from your own stack and the founder line on the homepage) is: a private yacht charter / experience brand serving Miami and Panama, monetizing bookings and qualified leads.</w:t>
+        <w:t>Koray’s first rule is still lock source context. Feeling Yachty’s operating truth is a private yacht charter / experience brand serving Miami and Panama. The operator lock says how that map is expressed in URLs:</w:t>
       </w:r>
     </w:p>
     <w:p>
@@ -817,22 +1015,7 @@
           <w:color w:val="14160F"/>
           <w:sz w:val="22"/>
         </w:rPr>
-        <w:t>The live homepage does not say that. The H1 is “Miami Yacht Rental.” The first screen is Biscayne Bay, birthdays, pink yachts, and a Miami inventory widget (“Showing 27 of 178 yachts”). Panama appears much later, in a founder bio: Fernando Yemail, licensed Florida yacht broker, “serving both Miami and Panama.” A crawler that only reads the top of / will classify this site as a Miami rental marketplace, not a two-city charter operator.</w:t>
-      </w:r>
-    </w:p>
-    <w:p>
-      <w:pPr>
-        <w:spacing w:after="160" w:before="0" w:line="276" w:lineRule="auto"/>
-      </w:pPr>
-      <w:r>
-        <w:rPr>
-          <w:rFonts w:ascii="Calibri" w:hAnsi="Calibri" w:eastAsia="Calibri"/>
-          <w:b w:val="0"/>
-          <w:i w:val="0"/>
-          <w:color w:val="14160F"/>
-          <w:sz w:val="22"/>
-        </w:rPr>
-        <w:t>Spanish /es/ is a Miami homepage translation (“Alquiler de yates en Miami”), not a Panama-aware brand roof. hreflang is implemented (en-US, es-CO, en, es) — that part is fine. The problem is you mirrored the wrong roof.</w:t>
+        <w:t>The live homepage H1 is “Miami Yacht Rental.” That is intentional. Home is the URL that ranks most for Miami. Panama is not a homepage footnote problem — /panama-yacht-rentals/ already ranks in Panama and stays its own city page. Spanish /es/ is the Miami homepage twin, which is correct under this lock. hreflang (en-US, es-CO, en, es) is fine.</w:t>
       </w:r>
     </w:p>
     <w:p>
@@ -844,7 +1027,7 @@
           <w:rFonts w:ascii="Calibri" w:hAnsi="Calibri"/>
           <w:color w:val="14160F"/>
         </w:rPr>
-        <w:t>What “good” looks like</w:t>
+        <w:t>What “good” looks like under the lock</w:t>
       </w:r>
     </w:p>
     <w:p>
@@ -860,7 +1043,7 @@
           <w:color w:val="14160F"/>
           <w:sz w:val="22"/>
         </w:rPr>
-        <w:t>Homepage owns brand + two destinations + how booking works. It does not compete with the Miami money URL.</w:t>
+        <w:t>Homepage keeps the Miami H1 and remains the Miami ranker.</w:t>
       </w:r>
     </w:p>
     <w:p>
@@ -876,7 +1059,7 @@
           <w:color w:val="14160F"/>
           <w:sz w:val="22"/>
         </w:rPr>
-        <w:t>/miami-yacht-rental/ (or one chosen slug) owns Miami commercial charter.</w:t>
+        <w:t>/miami-yacht-rental/, /miami-yacht-charters/, cheap, affordable, luxury, directory, and capacity pages each rank for their own query. Do not 301 them together.</w:t>
       </w:r>
     </w:p>
     <w:p>
@@ -892,7 +1075,7 @@
           <w:color w:val="14160F"/>
           <w:sz w:val="22"/>
         </w:rPr>
-        <w:t>/panama-yacht-rentals/ owns Panama commercial charter — this page is already the closest to the bar.</w:t>
+        <w:t>/panama-yacht-rentals/ stays the Panama ranker. Do not merge it into home.</w:t>
       </w:r>
     </w:p>
     <w:p>
@@ -908,7 +1091,23 @@
           <w:color w:val="14160F"/>
           <w:sz w:val="22"/>
         </w:rPr>
-        <w:t>Fort Lauderdale is either a real third money node or a Miami-area location page. It cannot be both.</w:t>
+        <w:t>Fort Lauderdale can rank as its own city only if the live H1/body stay FTL (today the next H1 is North Miami).</w:t>
+      </w:r>
+    </w:p>
+    <w:p>
+      <w:pPr>
+        <w:pStyle w:val="ListBullet"/>
+        <w:spacing w:after="80"/>
+      </w:pPr>
+      <w:r>
+        <w:rPr>
+          <w:rFonts w:ascii="Calibri" w:hAnsi="Calibri" w:eastAsia="Calibri"/>
+          <w:b w:val="0"/>
+          <w:i w:val="0"/>
+          <w:color w:val="14160F"/>
+          <w:sz w:val="22"/>
+        </w:rPr>
+        <w:t>A URL that collapses to another template is not ranking on its own — un-collapse it or accept it as an alias.</w:t>
       </w:r>
     </w:p>
     <w:p>
@@ -2915,7 +3114,7 @@
           <w:rFonts w:ascii="Calibri" w:hAnsi="Calibri"/>
           <w:color w:val="C49200"/>
         </w:rPr>
-        <w:t>5. Cannibalization registry</w:t>
+        <w:t>5. Own-page registry (operator-adjusted)</w:t>
       </w:r>
     </w:p>
     <w:p>
@@ -2930,7 +3129,7 @@
           <w:color w:val="14160F"/>
           <w:sz w:val="22"/>
         </w:rPr>
-        <w:t>Playbook A requires one owner URL per query cluster. Today several clusters have three to six plausible owners. I am assigning owners as a recommendation, not as a claim about current rankings.</w:t>
+        <w:t>Operator lock: every page and every city ranks on its own. The table below is not a merge list. It is which URL is allowed to rank for which query, and what still blocks that URL from ranking for itself.</w:t>
       </w:r>
     </w:p>
     <w:tbl>
@@ -2962,7 +3161,7 @@
                 <w:color w:val="FFF6D8"/>
                 <w:sz w:val="20"/>
               </w:rPr>
-              <w:t>Query cluster</w:t>
+              <w:t>Query / page</w:t>
             </w:r>
           </w:p>
         </w:tc>
@@ -2981,7 +3180,7 @@
                 <w:color w:val="FFF6D8"/>
                 <w:sz w:val="20"/>
               </w:rPr>
-              <w:t>Recommended owner</w:t>
+              <w:t>Ranking URL (keep)</w:t>
             </w:r>
           </w:p>
         </w:tc>
@@ -3000,7 +3199,7 @@
                 <w:color w:val="FFF6D8"/>
                 <w:sz w:val="20"/>
               </w:rPr>
-              <w:t>Current competitors (live)</w:t>
+              <w:t>What still blocks own-page ranking</w:t>
             </w:r>
           </w:p>
         </w:tc>
@@ -3039,7 +3238,7 @@
                 <w:color w:val="14160F"/>
                 <w:sz w:val="20"/>
               </w:rPr>
-              <w:t>Brand / Feeling Yachty</w:t>
+              <w:t>Miami yacht rental (home)</w:t>
             </w:r>
           </w:p>
         </w:tc>
@@ -3057,7 +3256,7 @@
                 <w:color w:val="14160F"/>
                 <w:sz w:val="20"/>
               </w:rPr>
-              <w:t>https://feelingyachty.com/  (rewritten)</w:t>
+              <w:t>https://feelingyachty.com/</w:t>
             </w:r>
           </w:p>
         </w:tc>
@@ -3075,7 +3274,7 @@
                 <w:color w:val="14160F"/>
                 <w:sz w:val="20"/>
               </w:rPr>
-              <w:t>Home currently targets Miami rental. Reviews, crew, contact also speak for the brand.</w:t>
+              <w:t>Nothing strategic. H1 Miami Yacht Rental is the point.</w:t>
             </w:r>
           </w:p>
         </w:tc>
@@ -3093,7 +3292,7 @@
                 <w:color w:val="14160F"/>
                 <w:sz w:val="20"/>
               </w:rPr>
-              <w:t>Rewrite home. Do not keep Miami H1 on /.</w:t>
+              <w:t>KEEP. Do not rewrite off Miami.</w:t>
             </w:r>
           </w:p>
         </w:tc>
@@ -3113,7 +3312,7 @@
                 <w:color w:val="14160F"/>
                 <w:sz w:val="20"/>
               </w:rPr>
-              <w:t>Miami yacht rental / charter (head)</w:t>
+              <w:t>Miami yacht rental (hub)</w:t>
             </w:r>
           </w:p>
         </w:tc>
@@ -3149,7 +3348,7 @@
                 <w:color w:val="14160F"/>
                 <w:sz w:val="20"/>
               </w:rPr>
-              <w:t>/ , /miami-yacht-charters/, /miami-yacht-rentals-directory/, emoji slug …feeling-yachty-2/, /luxury-yacht-rentals/, /miami-yachts-booking/</w:t>
+              <w:t>Plural /miami-yacht-rentals/ collapses here, so the plural slug is not ranking on its own.</w:t>
             </w:r>
           </w:p>
         </w:tc>
@@ -3167,7 +3366,7 @@
                 <w:color w:val="14160F"/>
                 <w:sz w:val="20"/>
               </w:rPr>
-              <w:t>Pick one. 301 or noindex the rest of the hubs.</w:t>
+              <w:t>KEEP hub. Un-collapse or accept the alias (CHG-012).</w:t>
             </w:r>
           </w:p>
         </w:tc>
@@ -3187,7 +3386,7 @@
                 <w:color w:val="14160F"/>
                 <w:sz w:val="20"/>
               </w:rPr>
-              <w:t>Cheap / budget Miami charter</w:t>
+              <w:t>Miami yacht charters</w:t>
             </w:r>
           </w:p>
         </w:tc>
@@ -3205,7 +3404,7 @@
                 <w:color w:val="14160F"/>
                 <w:sz w:val="20"/>
               </w:rPr>
-              <w:t>/cheap-yacht-rentals-miami/  OR merge into owner with a filter</w:t>
+              <w:t>/miami-yacht-charters/</w:t>
             </w:r>
           </w:p>
         </w:tc>
@@ -3223,7 +3422,7 @@
                 <w:color w:val="14160F"/>
                 <w:sz w:val="20"/>
               </w:rPr>
-              <w:t>/affordable-yachts-rentals-miami/ is a near-clone (same “all fees included” pitch + same widget).</w:t>
+              <w:t>Shared widget is out of scope. Needs a unique H1/first passage for “charters.”</w:t>
             </w:r>
           </w:p>
         </w:tc>
@@ -3241,7 +3440,81 @@
                 <w:color w:val="14160F"/>
                 <w:sz w:val="20"/>
               </w:rPr>
-              <w:t>Keep one modifier page or none. Do not keep both.</w:t>
+              <w:t>KEEP as its own ranker. Do not 301.</w:t>
+            </w:r>
+          </w:p>
+        </w:tc>
+      </w:tr>
+      <w:tr>
+        <w:tc>
+          <w:tcPr>
+            <w:tcW w:type="dxa" w:w="2376"/>
+          </w:tcPr>
+          <w:p>
+            <w:r/>
+            <w:r>
+              <w:rPr>
+                <w:rFonts w:ascii="Calibri" w:hAnsi="Calibri" w:eastAsia="Calibri"/>
+                <w:b w:val="0"/>
+                <w:i w:val="0"/>
+                <w:color w:val="14160F"/>
+                <w:sz w:val="20"/>
+              </w:rPr>
+              <w:t>Cheap / affordable Miami</w:t>
+            </w:r>
+          </w:p>
+        </w:tc>
+        <w:tc>
+          <w:tcPr>
+            <w:tcW w:type="dxa" w:w="2376"/>
+          </w:tcPr>
+          <w:p>
+            <w:r/>
+            <w:r>
+              <w:rPr>
+                <w:rFonts w:ascii="Calibri" w:hAnsi="Calibri" w:eastAsia="Calibri"/>
+                <w:b w:val="0"/>
+                <w:i w:val="0"/>
+                <w:color w:val="14160F"/>
+                <w:sz w:val="20"/>
+              </w:rPr>
+              <w:t>Both URLs keep their own slug</w:t>
+            </w:r>
+          </w:p>
+        </w:tc>
+        <w:tc>
+          <w:tcPr>
+            <w:tcW w:type="dxa" w:w="2376"/>
+          </w:tcPr>
+          <w:p>
+            <w:r/>
+            <w:r>
+              <w:rPr>
+                <w:rFonts w:ascii="Calibri" w:hAnsi="Calibri" w:eastAsia="Calibri"/>
+                <w:b w:val="0"/>
+                <w:i w:val="0"/>
+                <w:color w:val="14160F"/>
+                <w:sz w:val="20"/>
+              </w:rPr>
+              <w:t>/yacht-specials/ and /miami-yacht-deals/ resolve to the cheap template.</w:t>
+            </w:r>
+          </w:p>
+        </w:tc>
+        <w:tc>
+          <w:tcPr>
+            <w:tcW w:type="dxa" w:w="2376"/>
+          </w:tcPr>
+          <w:p>
+            <w:r/>
+            <w:r>
+              <w:rPr>
+                <w:rFonts w:ascii="Calibri" w:hAnsi="Calibri" w:eastAsia="Calibri"/>
+                <w:b w:val="0"/>
+                <w:i w:val="0"/>
+                <w:color w:val="14160F"/>
+                <w:sz w:val="20"/>
+              </w:rPr>
+              <w:t>KEEP cheap and affordable. Un-collapse specials/deals or accept as aliases.</w:t>
             </w:r>
           </w:p>
         </w:tc>
@@ -3297,7 +3570,7 @@
                 <w:color w:val="14160F"/>
                 <w:sz w:val="20"/>
               </w:rPr>
-              <w:t>Home filters, party CPT, individual pink listings, cheapest-folder copies.</w:t>
+              <w:t>Listings support it. Fine.</w:t>
             </w:r>
           </w:p>
         </w:tc>
@@ -3315,7 +3588,7 @@
                 <w:color w:val="14160F"/>
                 <w:sz w:val="20"/>
               </w:rPr>
-              <w:t>Hub + listings. Hub must not repeat the full 400-yacht grid.</w:t>
+              <w:t>KEEP.</w:t>
             </w:r>
           </w:p>
         </w:tc>
@@ -3335,7 +3608,7 @@
                 <w:color w:val="14160F"/>
                 <w:sz w:val="20"/>
               </w:rPr>
-              <w:t>Occasion: birthday Miami</w:t>
+              <w:t>Capacity (20 / 30 / 50 / 100)</w:t>
             </w:r>
           </w:p>
         </w:tc>
@@ -3353,7 +3626,7 @@
                 <w:color w:val="14160F"/>
                 <w:sz w:val="20"/>
               </w:rPr>
-              <w:t>/miami-yacht-party/birthday-yacht-rentals/  or the tip if you make the tip the KNOW owner</w:t>
+              <w:t>Each capacity URL</w:t>
             </w:r>
           </w:p>
         </w:tc>
@@ -3371,7 +3644,7 @@
                 <w:color w:val="14160F"/>
                 <w:sz w:val="20"/>
               </w:rPr>
-              <w:t>Party CPT + /miami-yacht-tips/birthday-yacht-itinerary-miami/ + 20/30/50-person pages.</w:t>
+              <w:t>/l00-person-yacht-rentals/ is a typo, so it cannot rank for 100-person.</w:t>
             </w:r>
           </w:p>
         </w:tc>
@@ -3389,81 +3662,7 @@
                 <w:color w:val="14160F"/>
                 <w:sz w:val="20"/>
               </w:rPr>
-              <w:t>One DO hub, one KNOW guide. Cross-link. Different H1s.</w:t>
-            </w:r>
-          </w:p>
-        </w:tc>
-      </w:tr>
-      <w:tr>
-        <w:tc>
-          <w:tcPr>
-            <w:tcW w:type="dxa" w:w="2376"/>
-          </w:tcPr>
-          <w:p>
-            <w:r/>
-            <w:r>
-              <w:rPr>
-                <w:rFonts w:ascii="Calibri" w:hAnsi="Calibri" w:eastAsia="Calibri"/>
-                <w:b w:val="0"/>
-                <w:i w:val="0"/>
-                <w:color w:val="14160F"/>
-                <w:sz w:val="20"/>
-              </w:rPr>
-              <w:t>Capacity modifiers (20 / 30 / 50 / 100 person)</w:t>
-            </w:r>
-          </w:p>
-        </w:tc>
-        <w:tc>
-          <w:tcPr>
-            <w:tcW w:type="dxa" w:w="2376"/>
-          </w:tcPr>
-          <w:p>
-            <w:r/>
-            <w:r>
-              <w:rPr>
-                <w:rFonts w:ascii="Calibri" w:hAnsi="Calibri" w:eastAsia="Calibri"/>
-                <w:b w:val="0"/>
-                <w:i w:val="0"/>
-                <w:color w:val="14160F"/>
-                <w:sz w:val="20"/>
-              </w:rPr>
-              <w:t>One capacity guide + filtered inventory</w:t>
-            </w:r>
-          </w:p>
-        </w:tc>
-        <w:tc>
-          <w:tcPr>
-            <w:tcW w:type="dxa" w:w="2376"/>
-          </w:tcPr>
-          <w:p>
-            <w:r/>
-            <w:r>
-              <w:rPr>
-                <w:rFonts w:ascii="Calibri" w:hAnsi="Calibri" w:eastAsia="Calibri"/>
-                <w:b w:val="0"/>
-                <w:i w:val="0"/>
-                <w:color w:val="14160F"/>
-                <w:sz w:val="20"/>
-              </w:rPr>
-              <w:t>/20-person-yacht-rental-miami/, /30-person-…, /50-person-…, /l00-person-yacht-rentals/ (typo).</w:t>
-            </w:r>
-          </w:p>
-        </w:tc>
-        <w:tc>
-          <w:tcPr>
-            <w:tcW w:type="dxa" w:w="2376"/>
-          </w:tcPr>
-          <w:p>
-            <w:r/>
-            <w:r>
-              <w:rPr>
-                <w:rFonts w:ascii="Calibri" w:hAnsi="Calibri" w:eastAsia="Calibri"/>
-                <w:b w:val="0"/>
-                <w:i w:val="0"/>
-                <w:color w:val="14160F"/>
-                <w:sz w:val="20"/>
-              </w:rPr>
-              <w:t>Fix typo. Do not grow a page per integer.</w:t>
+              <w:t>KEEP 20/30/50. Fix the 100-person slug.</w:t>
             </w:r>
           </w:p>
         </w:tc>
@@ -3519,7 +3718,7 @@
                 <w:color w:val="14160F"/>
                 <w:sz w:val="20"/>
               </w:rPr>
-              <w:t>Page H1 says Fort Lauderdale, next H1 says “Best North Miami Yacht Rentals.” Location CPT + events CPT.</w:t>
+              <w:t>Next H1 is “Best North Miami Yacht Rentals.”</w:t>
             </w:r>
           </w:p>
         </w:tc>
@@ -3537,7 +3736,7 @@
                 <w:color w:val="14160F"/>
                 <w:sz w:val="20"/>
               </w:rPr>
-              <w:t>Rewrite or it will rank for the wrong city — or neither.</w:t>
+              <w:t>Rewrite body to stay FTL if this city is meant to rank on its own.</w:t>
             </w:r>
           </w:p>
         </w:tc>
@@ -3593,7 +3792,7 @@
                 <w:color w:val="14160F"/>
                 <w:sz w:val="20"/>
               </w:rPr>
-              <w:t>Directory, party, sales, maintenance, tours, 97 tips. Cleaner than Miami.</w:t>
+              <w:t>Already ranks. Sales slug is Miami copy.</w:t>
             </w:r>
           </w:p>
         </w:tc>
@@ -3611,7 +3810,7 @@
                 <w:color w:val="14160F"/>
                 <w:sz w:val="20"/>
               </w:rPr>
-              <w:t>Keep. Do not clone Miami’s hub sprawl.</w:t>
+              <w:t>KEEP hub. Fix /panama-yacht-sales/ if that page should rank.</w:t>
             </w:r>
           </w:p>
         </w:tc>
@@ -3631,7 +3830,7 @@
                 <w:color w:val="14160F"/>
                 <w:sz w:val="20"/>
               </w:rPr>
-              <w:t>Single vessel (example: 26ft Bayliner Fendi)</w:t>
+              <w:t>Single vessel (example: Fendi)</w:t>
             </w:r>
           </w:p>
         </w:tc>
@@ -3667,7 +3866,7 @@
                 <w:color w:val="14160F"/>
                 <w:sz w:val="20"/>
               </w:rPr>
-              <w:t>Also in cheapest-yacht-rentals/miami/26ft-pink-bayliner-… and inventory cards on 5+ hubs.</w:t>
+              <w:t>Hub vs listing price noted; operator said hub/pricing is out of scope.</w:t>
             </w:r>
           </w:p>
         </w:tc>
@@ -3685,7 +3884,7 @@
                 <w:color w:val="14160F"/>
                 <w:sz w:val="20"/>
               </w:rPr>
-              <w:t>One canonical listing. Others 301.</w:t>
+              <w:t>Leave pricing. 301 only a thin second URL for the same boat.</w:t>
             </w:r>
           </w:p>
         </w:tc>
@@ -3728,7 +3927,7 @@
           <w:color w:val="14160F"/>
           <w:sz w:val="22"/>
         </w:rPr>
-        <w:t>Central entity claimed: Miami yacht rental — not Feeling Yachty the brand. Same pricing widget and FAQ pattern as the Miami hubs. Tips module is tagged “automation” in the HTML/text scrape (bachelor cost, bachelorette decorations). That is the n8n auto-blog leaking onto the money roof.</w:t>
+        <w:t>Central entity claimed: Miami yacht rental. That matches the operator lock — home is the Miami ranker. Same pricing widget as other Miami hubs (out of scope). Tips module is tagged “automation” in the scrape (bachelor cost, bachelorette decorations). That is the n8n auto-blog leaking onto the Miami ranker; prune thin tips, do not change the H1.</w:t>
       </w:r>
     </w:p>
     <w:tbl>
@@ -3835,7 +4034,7 @@
                 <w:color w:val="14160F"/>
                 <w:sz w:val="20"/>
               </w:rPr>
-              <w:t>1 / 5</w:t>
+              <w:t>4 / 5</w:t>
             </w:r>
           </w:p>
         </w:tc>
@@ -3853,7 +4052,7 @@
                 <w:color w:val="14160F"/>
                 <w:sz w:val="20"/>
               </w:rPr>
-              <w:t>Miami H1. Panama buried.</w:t>
+              <w:t>Miami H1 on purpose. Panama has its own ranking URL.</w:t>
             </w:r>
           </w:p>
         </w:tc>
@@ -3909,7 +4108,7 @@
                 <w:color w:val="14160F"/>
                 <w:sz w:val="20"/>
               </w:rPr>
-              <w:t>Widget has size/price/capacity. Brand EAV is thin.</w:t>
+              <w:t>Widget has size/price/capacity. Hub pricing out of scope.</w:t>
             </w:r>
           </w:p>
         </w:tc>
@@ -3947,7 +4146,7 @@
                 <w:color w:val="14160F"/>
                 <w:sz w:val="20"/>
               </w:rPr>
-              <w:t>3 / 5</w:t>
+              <w:t>4 / 5</w:t>
             </w:r>
           </w:p>
         </w:tc>
@@ -3965,7 +4164,7 @@
                 <w:color w:val="14160F"/>
                 <w:sz w:val="20"/>
               </w:rPr>
-              <w:t>Good DO catalog. Wrong URL for that job.</w:t>
+              <w:t>DO catalog on the URL that already ranks for Miami.</w:t>
             </w:r>
           </w:p>
         </w:tc>
@@ -4021,7 +4220,7 @@
                 <w:color w:val="14160F"/>
                 <w:sz w:val="20"/>
               </w:rPr>
-              <w:t>Trust badges + founder line. No unique brand definition up top.</w:t>
+              <w:t>Trust badges + founder line. Tips labeled automation.</w:t>
             </w:r>
           </w:p>
         </w:tc>
@@ -4077,7 +4276,7 @@
                 <w:color w:val="14160F"/>
                 <w:sz w:val="20"/>
               </w:rPr>
-              <w:t>Tips all point at /miami-yacht-tips/. Weak Panama bridge.</w:t>
+              <w:t>Tips all point at /miami-yacht-tips/. Panama is a separate city page.</w:t>
             </w:r>
           </w:p>
         </w:tc>
@@ -4097,7 +4296,7 @@
                 <w:color w:val="14160F"/>
                 <w:sz w:val="20"/>
               </w:rPr>
-              <w:t>Cannibalization safety</w:t>
+              <w:t>Own-page ranking</w:t>
             </w:r>
           </w:p>
         </w:tc>
@@ -4115,7 +4314,7 @@
                 <w:color w:val="14160F"/>
                 <w:sz w:val="20"/>
               </w:rPr>
-              <w:t>1 / 5</w:t>
+              <w:t>4 / 5</w:t>
             </w:r>
           </w:p>
         </w:tc>
@@ -4133,7 +4332,7 @@
                 <w:color w:val="14160F"/>
                 <w:sz w:val="20"/>
               </w:rPr>
-              <w:t>Competes with /miami-yacht-rental/ and /miami-yacht-charters/.</w:t>
+              <w:t>This is the Miami ranker. Do not move Miami off /.</w:t>
             </w:r>
           </w:p>
         </w:tc>
@@ -4171,7 +4370,7 @@
                 <w:color w:val="14160F"/>
                 <w:sz w:val="20"/>
               </w:rPr>
-              <w:t>2 / 5</w:t>
+              <w:t>3 / 5</w:t>
             </w:r>
           </w:p>
         </w:tc>
@@ -4189,7 +4388,7 @@
                 <w:color w:val="14160F"/>
                 <w:sz w:val="20"/>
               </w:rPr>
-              <w:t>2,500+ on the hero vs 2,400+ in the founder paragraph on the same page.</w:t>
+              <w:t>Review integers move to the shortcode. Phones stay city-specific.</w:t>
             </w:r>
           </w:p>
         </w:tc>
@@ -4208,7 +4407,7 @@
           <w:color w:val="14160F"/>
           <w:sz w:val="22"/>
         </w:rPr>
-        <w:t>Decision: rewrite. Keep /. Change the job.</w:t>
+        <w:t>Decision: KEEP. Homepage stays the Miami ranker.</w:t>
       </w:r>
     </w:p>
     <w:p>
@@ -4250,7 +4449,7 @@
           <w:color w:val="14160F"/>
           <w:sz w:val="22"/>
         </w:rPr>
-        <w:t>Decision: one owner. 301 the loser. Do not “differentiate” with synonyms.</w:t>
+        <w:t>Decision: KEEP both. Each ranks for its own query. Unique H1/first passage — do not 301.</w:t>
       </w:r>
     </w:p>
     <w:p>
@@ -4292,7 +4491,7 @@
           <w:color w:val="14160F"/>
           <w:sz w:val="22"/>
         </w:rPr>
-        <w:t>Decision: merge. One budget page, or a filter on the owner hub. Never both.</w:t>
+        <w:t>Decision: KEEP both as own rankers. Hub/widget pricing is out of scope. Specials/deals that collapse here are CHG-012.</w:t>
       </w:r>
     </w:p>
     <w:p>
@@ -4762,7 +4961,7 @@
                 <w:color w:val="14160F"/>
                 <w:sz w:val="20"/>
               </w:rPr>
-              <w:t>3 / 5</w:t>
+              <w:t>4 / 5</w:t>
             </w:r>
           </w:p>
         </w:tc>
@@ -4780,7 +4979,7 @@
                 <w:color w:val="14160F"/>
                 <w:sz w:val="20"/>
               </w:rPr>
-              <w:t>Phone disagrees with the contact page (see §8).</w:t>
+              <w:t>City phone on this page is intentional (operator).</w:t>
             </w:r>
           </w:p>
         </w:tc>
@@ -4799,7 +4998,7 @@
           <w:color w:val="14160F"/>
           <w:sz w:val="22"/>
         </w:rPr>
-        <w:t>Decision: keep and reinforce. This is the template for Miami after the merge.</w:t>
+        <w:t>Decision: KEEP. Already ranks in Panama. Do not merge into the homepage.</w:t>
       </w:r>
     </w:p>
     <w:p>
@@ -4841,7 +5040,7 @@
           <w:color w:val="14160F"/>
           <w:sz w:val="22"/>
         </w:rPr>
-        <w:t>Decision: rewrite as a true FTL/Haulover location page, or 301 into Miami location architecture.</w:t>
+        <w:t>Decision: rewrite so this URL can rank as Fort Lauderdale. If the next H1 stays North Miami, FTL cannot rank on its own.</w:t>
       </w:r>
     </w:p>
     <w:p>
@@ -4883,7 +5082,7 @@
           <w:color w:val="14160F"/>
           <w:sz w:val="22"/>
         </w:rPr>
-        <w:t>Decision: keep /fleet/miami/{slug}/ as the listing pattern. 301 folder copies. Lock capacity to the real max.</w:t>
+        <w:t>Decision: hub/listing price is out of scope (operator). 301 only a thin second URL for the same boat.</w:t>
       </w:r>
     </w:p>
     <w:p>
@@ -5138,7 +5337,7 @@
           <w:color w:val="14160F"/>
           <w:sz w:val="22"/>
         </w:rPr>
-        <w:t>Playbook E: the brand query should resolve to a yacht charter operator with one NAP and one story. Snapshot for “Feeling Yachty” (Firecrawl search, 14 August 2026): official site, Instagram @feeling.yachty, Yelp, Tripadvisor, Trustpilot, Facebook. Panama is an emoji on Instagram, not a second Brand SERP estate. That is acceptable if Miami is the demand center. It is not acceptable if phones and addresses disagree.</w:t>
+        <w:t>Playbook E: the brand query should resolve to a yacht charter operator with a stable story. Snapshot for “Feeling Yachty” (Firecrawl search, 14 August 2026): official site, Instagram @feeling.yachty, Yelp, Tripadvisor, Trustpilot, Facebook. Panama is an emoji on Instagram, not a second Brand SERP estate. Operator lock: Miami vs Panama phone numbers are intentional. Do not unify them.</w:t>
       </w:r>
     </w:p>
     <w:tbl>
@@ -5674,7 +5873,7 @@
           <w:color w:val="14160F"/>
           <w:sz w:val="22"/>
         </w:rPr>
-        <w:t>Jason Barnard’s Brand SERP point (as Koray cites it): corroboration. Right now third-party profiles and on-site pages are teaching the entity different phone numbers. Fix the sources. Do not add more neighborhood GBPs until NAP is one row.</w:t>
+        <w:t>Jason Barnard’s Brand SERP point (as Koray cites it): corroboration. Third-party profiles may still show older Miami numbers. That is a listings-cleanup item if you want it later — not a reason to change the city-specific numbers on the site. Review integers go to the shortcode.</w:t>
       </w:r>
     </w:p>
     <w:p>
@@ -5716,7 +5915,7 @@
           <w:rFonts w:ascii="Calibri" w:hAnsi="Calibri"/>
           <w:color w:val="C49200"/>
         </w:rPr>
-        <w:t>8. Contradiction hunt (must fix before new content)</w:t>
+        <w:t>8. What still blocks a URL from ranking on its own</w:t>
       </w:r>
     </w:p>
     <w:p>
@@ -5731,7 +5930,7 @@
           <w:color w:val="14160F"/>
           <w:sz w:val="22"/>
         </w:rPr>
-        <w:t>Koray: historical data compounds when facts stay stable. PACMAN upgrade: hunt contradictions before publish. These are live today.</w:t>
+        <w:t>Operator lock: phones and hub/pricing are out of scope. Review integers move to shortcodes. These rows are the remaining own-page blockers.</w:t>
       </w:r>
     </w:p>
     <w:tbl>
@@ -5820,303 +6019,7 @@
                 <w:color w:val="FFF6D8"/>
                 <w:sz w:val="20"/>
               </w:rPr>
-              <w:t>Risk</w:t>
-            </w:r>
-          </w:p>
-        </w:tc>
-      </w:tr>
-      <w:tr>
-        <w:tc>
-          <w:tcPr>
-            <w:tcW w:type="dxa" w:w="2376"/>
-          </w:tcPr>
-          <w:p>
-            <w:r/>
-            <w:r>
-              <w:rPr>
-                <w:rFonts w:ascii="Calibri" w:hAnsi="Calibri" w:eastAsia="Calibri"/>
-                <w:b w:val="0"/>
-                <w:i w:val="0"/>
-                <w:color w:val="14160F"/>
-                <w:sz w:val="20"/>
-              </w:rPr>
-              <w:t>Inclusions</w:t>
-            </w:r>
-          </w:p>
-        </w:tc>
-        <w:tc>
-          <w:tcPr>
-            <w:tcW w:type="dxa" w:w="2376"/>
-          </w:tcPr>
-          <w:p>
-            <w:r/>
-            <w:r>
-              <w:rPr>
-                <w:rFonts w:ascii="Calibri" w:hAnsi="Calibri" w:eastAsia="Calibri"/>
-                <w:b w:val="0"/>
-                <w:i w:val="0"/>
-                <w:color w:val="14160F"/>
-                <w:sz w:val="20"/>
-              </w:rPr>
-              <w:t>Cheap/affordable/FTL: all fees / captain / fuel included</w:t>
-            </w:r>
-          </w:p>
-        </w:tc>
-        <w:tc>
-          <w:tcPr>
-            <w:tcW w:type="dxa" w:w="2376"/>
-          </w:tcPr>
-          <w:p>
-            <w:r/>
-            <w:r>
-              <w:rPr>
-                <w:rFonts w:ascii="Calibri" w:hAnsi="Calibri" w:eastAsia="Calibri"/>
-                <w:b w:val="0"/>
-                <w:i w:val="0"/>
-                <w:color w:val="14160F"/>
-                <w:sz w:val="20"/>
-              </w:rPr>
-              <w:t>Shared widget: “Crew and fuel are additional.”</w:t>
-            </w:r>
-          </w:p>
-        </w:tc>
-        <w:tc>
-          <w:tcPr>
-            <w:tcW w:type="dxa" w:w="2376"/>
-          </w:tcPr>
-          <w:p>
-            <w:r/>
-            <w:r>
-              <w:rPr>
-                <w:rFonts w:ascii="Calibri" w:hAnsi="Calibri" w:eastAsia="Calibri"/>
-                <w:b w:val="0"/>
-                <w:i w:val="0"/>
-                <w:color w:val="14160F"/>
-                <w:sz w:val="20"/>
-              </w:rPr>
-              <w:t>Guest + crawler distrust. Possible ads issue.</w:t>
-            </w:r>
-          </w:p>
-        </w:tc>
-      </w:tr>
-      <w:tr>
-        <w:tc>
-          <w:tcPr>
-            <w:tcW w:type="dxa" w:w="2376"/>
-          </w:tcPr>
-          <w:p>
-            <w:r/>
-            <w:r>
-              <w:rPr>
-                <w:rFonts w:ascii="Calibri" w:hAnsi="Calibri" w:eastAsia="Calibri"/>
-                <w:b w:val="0"/>
-                <w:i w:val="0"/>
-                <w:color w:val="14160F"/>
-                <w:sz w:val="20"/>
-              </w:rPr>
-              <w:t>Deposit</w:t>
-            </w:r>
-          </w:p>
-        </w:tc>
-        <w:tc>
-          <w:tcPr>
-            <w:tcW w:type="dxa" w:w="2376"/>
-          </w:tcPr>
-          <w:p>
-            <w:r/>
-            <w:r>
-              <w:rPr>
-                <w:rFonts w:ascii="Calibri" w:hAnsi="Calibri" w:eastAsia="Calibri"/>
-                <w:b w:val="0"/>
-                <w:i w:val="0"/>
-                <w:color w:val="14160F"/>
-                <w:sz w:val="20"/>
-              </w:rPr>
-              <w:t>Only $1,400+ pays 20%</w:t>
-            </w:r>
-          </w:p>
-        </w:tc>
-        <w:tc>
-          <w:tcPr>
-            <w:tcW w:type="dxa" w:w="2376"/>
-          </w:tcPr>
-          <w:p>
-            <w:r/>
-            <w:r>
-              <w:rPr>
-                <w:rFonts w:ascii="Calibri" w:hAnsi="Calibri" w:eastAsia="Calibri"/>
-                <w:b w:val="0"/>
-                <w:i w:val="0"/>
-                <w:color w:val="14160F"/>
-                <w:sz w:val="20"/>
-              </w:rPr>
-              <w:t>Fendi listing: “Due today $500” plus 20% rule for $1,400+</w:t>
-            </w:r>
-          </w:p>
-        </w:tc>
-        <w:tc>
-          <w:tcPr>
-            <w:tcW w:type="dxa" w:w="2376"/>
-          </w:tcPr>
-          <w:p>
-            <w:r/>
-            <w:r>
-              <w:rPr>
-                <w:rFonts w:ascii="Calibri" w:hAnsi="Calibri" w:eastAsia="Calibri"/>
-                <w:b w:val="0"/>
-                <w:i w:val="0"/>
-                <w:color w:val="14160F"/>
-                <w:sz w:val="20"/>
-              </w:rPr>
-              <w:t>Needs one ruleset in writing.</w:t>
-            </w:r>
-          </w:p>
-        </w:tc>
-      </w:tr>
-      <w:tr>
-        <w:tc>
-          <w:tcPr>
-            <w:tcW w:type="dxa" w:w="2376"/>
-          </w:tcPr>
-          <w:p>
-            <w:r/>
-            <w:r>
-              <w:rPr>
-                <w:rFonts w:ascii="Calibri" w:hAnsi="Calibri" w:eastAsia="Calibri"/>
-                <w:b w:val="0"/>
-                <w:i w:val="0"/>
-                <w:color w:val="14160F"/>
-                <w:sz w:val="20"/>
-              </w:rPr>
-              <w:t>Fendi price</w:t>
-            </w:r>
-          </w:p>
-        </w:tc>
-        <w:tc>
-          <w:tcPr>
-            <w:tcW w:type="dxa" w:w="2376"/>
-          </w:tcPr>
-          <w:p>
-            <w:r/>
-            <w:r>
-              <w:rPr>
-                <w:rFonts w:ascii="Calibri" w:hAnsi="Calibri" w:eastAsia="Calibri"/>
-                <w:b w:val="0"/>
-                <w:i w:val="0"/>
-                <w:color w:val="14160F"/>
-                <w:sz w:val="20"/>
-              </w:rPr>
-              <w:t>Hub card: $800 / 4 hours</w:t>
-            </w:r>
-          </w:p>
-        </w:tc>
-        <w:tc>
-          <w:tcPr>
-            <w:tcW w:type="dxa" w:w="2376"/>
-          </w:tcPr>
-          <w:p>
-            <w:r/>
-            <w:r>
-              <w:rPr>
-                <w:rFonts w:ascii="Calibri" w:hAnsi="Calibri" w:eastAsia="Calibri"/>
-                <w:b w:val="0"/>
-                <w:i w:val="0"/>
-                <w:color w:val="14160F"/>
-                <w:sz w:val="20"/>
-              </w:rPr>
-              <w:t>Listing: $500 due today</w:t>
-            </w:r>
-          </w:p>
-        </w:tc>
-        <w:tc>
-          <w:tcPr>
-            <w:tcW w:type="dxa" w:w="2376"/>
-          </w:tcPr>
-          <w:p>
-            <w:r/>
-            <w:r>
-              <w:rPr>
-                <w:rFonts w:ascii="Calibri" w:hAnsi="Calibri" w:eastAsia="Calibri"/>
-                <w:b w:val="0"/>
-                <w:i w:val="0"/>
-                <w:color w:val="14160F"/>
-                <w:sz w:val="20"/>
-              </w:rPr>
-              <w:t>Same entity, two prices.</w:t>
-            </w:r>
-          </w:p>
-        </w:tc>
-      </w:tr>
-      <w:tr>
-        <w:tc>
-          <w:tcPr>
-            <w:tcW w:type="dxa" w:w="2376"/>
-          </w:tcPr>
-          <w:p>
-            <w:r/>
-            <w:r>
-              <w:rPr>
-                <w:rFonts w:ascii="Calibri" w:hAnsi="Calibri" w:eastAsia="Calibri"/>
-                <w:b w:val="0"/>
-                <w:i w:val="0"/>
-                <w:color w:val="14160F"/>
-                <w:sz w:val="20"/>
-              </w:rPr>
-              <w:t>Fendi capacity</w:t>
-            </w:r>
-          </w:p>
-        </w:tc>
-        <w:tc>
-          <w:tcPr>
-            <w:tcW w:type="dxa" w:w="2376"/>
-          </w:tcPr>
-          <w:p>
-            <w:r/>
-            <w:r>
-              <w:rPr>
-                <w:rFonts w:ascii="Calibri" w:hAnsi="Calibri" w:eastAsia="Calibri"/>
-                <w:b w:val="0"/>
-                <w:i w:val="0"/>
-                <w:color w:val="14160F"/>
-                <w:sz w:val="20"/>
-              </w:rPr>
-              <w:t>Hub: max 13</w:t>
-            </w:r>
-          </w:p>
-        </w:tc>
-        <w:tc>
-          <w:tcPr>
-            <w:tcW w:type="dxa" w:w="2376"/>
-          </w:tcPr>
-          <w:p>
-            <w:r/>
-            <w:r>
-              <w:rPr>
-                <w:rFonts w:ascii="Calibri" w:hAnsi="Calibri" w:eastAsia="Calibri"/>
-                <w:b w:val="0"/>
-                <w:i w:val="0"/>
-                <w:color w:val="14160F"/>
-                <w:sz w:val="20"/>
-              </w:rPr>
-              <w:t>Listing selector: 1–40</w:t>
-            </w:r>
-          </w:p>
-        </w:tc>
-        <w:tc>
-          <w:tcPr>
-            <w:tcW w:type="dxa" w:w="2376"/>
-          </w:tcPr>
-          <w:p>
-            <w:r/>
-            <w:r>
-              <w:rPr>
-                <w:rFonts w:ascii="Calibri" w:hAnsi="Calibri" w:eastAsia="Calibri"/>
-                <w:b w:val="0"/>
-                <w:i w:val="0"/>
-                <w:color w:val="14160F"/>
-                <w:sz w:val="20"/>
-              </w:rPr>
-              <w:t>Safety + legal. Fix even if SEO were perfect.</w:t>
+              <w:t>Disposition</w:t>
             </w:r>
           </w:p>
         </w:tc>
@@ -6172,7 +6075,7 @@
                 <w:color w:val="14160F"/>
                 <w:sz w:val="20"/>
               </w:rPr>
-              <w:t>Tripadvisor badge 2025 cited</w:t>
+              <w:t>Hard-coded while the brand grew</w:t>
             </w:r>
           </w:p>
         </w:tc>
@@ -6190,155 +6093,7 @@
                 <w:color w:val="14160F"/>
                 <w:sz w:val="20"/>
               </w:rPr>
-              <w:t>Pick one audited number or say “reviews across platforms” with no integer.</w:t>
-            </w:r>
-          </w:p>
-        </w:tc>
-      </w:tr>
-      <w:tr>
-        <w:tc>
-          <w:tcPr>
-            <w:tcW w:type="dxa" w:w="2376"/>
-          </w:tcPr>
-          <w:p>
-            <w:r/>
-            <w:r>
-              <w:rPr>
-                <w:rFonts w:ascii="Calibri" w:hAnsi="Calibri" w:eastAsia="Calibri"/>
-                <w:b w:val="0"/>
-                <w:i w:val="0"/>
-                <w:color w:val="14160F"/>
-                <w:sz w:val="20"/>
-              </w:rPr>
-              <w:t>Panama phone</w:t>
-            </w:r>
-          </w:p>
-        </w:tc>
-        <w:tc>
-          <w:tcPr>
-            <w:tcW w:type="dxa" w:w="2376"/>
-          </w:tcPr>
-          <w:p>
-            <w:r/>
-            <w:r>
-              <w:rPr>
-                <w:rFonts w:ascii="Calibri" w:hAnsi="Calibri" w:eastAsia="Calibri"/>
-                <w:b w:val="0"/>
-                <w:i w:val="0"/>
-                <w:color w:val="14160F"/>
-                <w:sz w:val="20"/>
-              </w:rPr>
-              <w:t>202-1729</w:t>
-            </w:r>
-          </w:p>
-        </w:tc>
-        <w:tc>
-          <w:tcPr>
-            <w:tcW w:type="dxa" w:w="2376"/>
-          </w:tcPr>
-          <w:p>
-            <w:r/>
-            <w:r>
-              <w:rPr>
-                <w:rFonts w:ascii="Calibri" w:hAnsi="Calibri" w:eastAsia="Calibri"/>
-                <w:b w:val="0"/>
-                <w:i w:val="0"/>
-                <w:color w:val="14160F"/>
-                <w:sz w:val="20"/>
-              </w:rPr>
-              <w:t>202-1279</w:t>
-            </w:r>
-          </w:p>
-        </w:tc>
-        <w:tc>
-          <w:tcPr>
-            <w:tcW w:type="dxa" w:w="2376"/>
-          </w:tcPr>
-          <w:p>
-            <w:r/>
-            <w:r>
-              <w:rPr>
-                <w:rFonts w:ascii="Calibri" w:hAnsi="Calibri" w:eastAsia="Calibri"/>
-                <w:b w:val="0"/>
-                <w:i w:val="0"/>
-                <w:color w:val="14160F"/>
-                <w:sz w:val="20"/>
-              </w:rPr>
-              <w:t>Leads go to the wrong line.</w:t>
-            </w:r>
-          </w:p>
-        </w:tc>
-      </w:tr>
-      <w:tr>
-        <w:tc>
-          <w:tcPr>
-            <w:tcW w:type="dxa" w:w="2376"/>
-          </w:tcPr>
-          <w:p>
-            <w:r/>
-            <w:r>
-              <w:rPr>
-                <w:rFonts w:ascii="Calibri" w:hAnsi="Calibri" w:eastAsia="Calibri"/>
-                <w:b w:val="0"/>
-                <w:i w:val="0"/>
-                <w:color w:val="14160F"/>
-                <w:sz w:val="20"/>
-              </w:rPr>
-              <w:t>US phones</w:t>
-            </w:r>
-          </w:p>
-        </w:tc>
-        <w:tc>
-          <w:tcPr>
-            <w:tcW w:type="dxa" w:w="2376"/>
-          </w:tcPr>
-          <w:p>
-            <w:r/>
-            <w:r>
-              <w:rPr>
-                <w:rFonts w:ascii="Calibri" w:hAnsi="Calibri" w:eastAsia="Calibri"/>
-                <w:b w:val="0"/>
-                <w:i w:val="0"/>
-                <w:color w:val="14160F"/>
-                <w:sz w:val="20"/>
-              </w:rPr>
-              <w:t>954 / 754 / 786</w:t>
-            </w:r>
-          </w:p>
-        </w:tc>
-        <w:tc>
-          <w:tcPr>
-            <w:tcW w:type="dxa" w:w="2376"/>
-          </w:tcPr>
-          <w:p>
-            <w:r/>
-            <w:r>
-              <w:rPr>
-                <w:rFonts w:ascii="Calibri" w:hAnsi="Calibri" w:eastAsia="Calibri"/>
-                <w:b w:val="0"/>
-                <w:i w:val="0"/>
-                <w:color w:val="14160F"/>
-                <w:sz w:val="20"/>
-              </w:rPr>
-              <w:t>Three public numbers</w:t>
-            </w:r>
-          </w:p>
-        </w:tc>
-        <w:tc>
-          <w:tcPr>
-            <w:tcW w:type="dxa" w:w="2376"/>
-          </w:tcPr>
-          <w:p>
-            <w:r/>
-            <w:r>
-              <w:rPr>
-                <w:rFonts w:ascii="Calibri" w:hAnsi="Calibri" w:eastAsia="Calibri"/>
-                <w:b w:val="0"/>
-                <w:i w:val="0"/>
-                <w:color w:val="14160F"/>
-                <w:sz w:val="20"/>
-              </w:rPr>
-              <w:t>Brand SERP fragmentation.</w:t>
+              <w:t>CHG-011 shortcode. Operator will add.</w:t>
             </w:r>
           </w:p>
         </w:tc>
@@ -6412,7 +6167,7 @@
                 <w:color w:val="14160F"/>
                 <w:sz w:val="20"/>
               </w:rPr>
-              <w:t>Wrong entity on the URL.</w:t>
+              <w:t>CHG-007. FTL cannot rank as FTL until the body stays FTL.</w:t>
             </w:r>
           </w:p>
         </w:tc>
@@ -6432,7 +6187,7 @@
                 <w:color w:val="14160F"/>
                 <w:sz w:val="20"/>
               </w:rPr>
-              <w:t>Superlative</w:t>
+              <w:t>Destinations slug</w:t>
             </w:r>
           </w:p>
         </w:tc>
@@ -6450,7 +6205,7 @@
                 <w:color w:val="14160F"/>
                 <w:sz w:val="20"/>
               </w:rPr>
-              <w:t>“ONLY company in Miami that gives away a free hour”</w:t>
+              <w:t>/miami-yacht-destinations/</w:t>
             </w:r>
           </w:p>
         </w:tc>
@@ -6468,7 +6223,7 @@
                 <w:color w:val="14160F"/>
                 <w:sz w:val="20"/>
               </w:rPr>
-              <w:t>Unverified on-page</w:t>
+              <w:t>Live content is List your boat</w:t>
             </w:r>
           </w:p>
         </w:tc>
@@ -6486,7 +6241,377 @@
                 <w:color w:val="14160F"/>
                 <w:sz w:val="20"/>
               </w:rPr>
-              <w:t>Remove or prove.</w:t>
+              <w:t>CHG-007. Cannot rank for destinations.</w:t>
+            </w:r>
+          </w:p>
+        </w:tc>
+      </w:tr>
+      <w:tr>
+        <w:tc>
+          <w:tcPr>
+            <w:tcW w:type="dxa" w:w="2376"/>
+          </w:tcPr>
+          <w:p>
+            <w:r/>
+            <w:r>
+              <w:rPr>
+                <w:rFonts w:ascii="Calibri" w:hAnsi="Calibri" w:eastAsia="Calibri"/>
+                <w:b w:val="0"/>
+                <w:i w:val="0"/>
+                <w:color w:val="14160F"/>
+                <w:sz w:val="20"/>
+              </w:rPr>
+              <w:t>Panama sales slug</w:t>
+            </w:r>
+          </w:p>
+        </w:tc>
+        <w:tc>
+          <w:tcPr>
+            <w:tcW w:type="dxa" w:w="2376"/>
+          </w:tcPr>
+          <w:p>
+            <w:r/>
+            <w:r>
+              <w:rPr>
+                <w:rFonts w:ascii="Calibri" w:hAnsi="Calibri" w:eastAsia="Calibri"/>
+                <w:b w:val="0"/>
+                <w:i w:val="0"/>
+                <w:color w:val="14160F"/>
+                <w:sz w:val="20"/>
+              </w:rPr>
+              <w:t>/panama-yacht-sales/</w:t>
+            </w:r>
+          </w:p>
+        </w:tc>
+        <w:tc>
+          <w:tcPr>
+            <w:tcW w:type="dxa" w:w="2376"/>
+          </w:tcPr>
+          <w:p>
+            <w:r/>
+            <w:r>
+              <w:rPr>
+                <w:rFonts w:ascii="Calibri" w:hAnsi="Calibri" w:eastAsia="Calibri"/>
+                <w:b w:val="0"/>
+                <w:i w:val="0"/>
+                <w:color w:val="14160F"/>
+                <w:sz w:val="20"/>
+              </w:rPr>
+              <w:t>Live content is Miami rental</w:t>
+            </w:r>
+          </w:p>
+        </w:tc>
+        <w:tc>
+          <w:tcPr>
+            <w:tcW w:type="dxa" w:w="2376"/>
+          </w:tcPr>
+          <w:p>
+            <w:r/>
+            <w:r>
+              <w:rPr>
+                <w:rFonts w:ascii="Calibri" w:hAnsi="Calibri" w:eastAsia="Calibri"/>
+                <w:b w:val="0"/>
+                <w:i w:val="0"/>
+                <w:color w:val="14160F"/>
+                <w:sz w:val="20"/>
+              </w:rPr>
+              <w:t>CHG-007. Cannot rank as Panama sales.</w:t>
+            </w:r>
+          </w:p>
+        </w:tc>
+      </w:tr>
+      <w:tr>
+        <w:tc>
+          <w:tcPr>
+            <w:tcW w:type="dxa" w:w="2376"/>
+          </w:tcPr>
+          <w:p>
+            <w:r/>
+            <w:r>
+              <w:rPr>
+                <w:rFonts w:ascii="Calibri" w:hAnsi="Calibri" w:eastAsia="Calibri"/>
+                <w:b w:val="0"/>
+                <w:i w:val="0"/>
+                <w:color w:val="14160F"/>
+                <w:sz w:val="20"/>
+              </w:rPr>
+              <w:t>Reviews slug</w:t>
+            </w:r>
+          </w:p>
+        </w:tc>
+        <w:tc>
+          <w:tcPr>
+            <w:tcW w:type="dxa" w:w="2376"/>
+          </w:tcPr>
+          <w:p>
+            <w:r/>
+            <w:r>
+              <w:rPr>
+                <w:rFonts w:ascii="Calibri" w:hAnsi="Calibri" w:eastAsia="Calibri"/>
+                <w:b w:val="0"/>
+                <w:i w:val="0"/>
+                <w:color w:val="14160F"/>
+                <w:sz w:val="20"/>
+              </w:rPr>
+              <w:t>/feeling-yachty-reviews/</w:t>
+            </w:r>
+          </w:p>
+        </w:tc>
+        <w:tc>
+          <w:tcPr>
+            <w:tcW w:type="dxa" w:w="2376"/>
+          </w:tcPr>
+          <w:p>
+            <w:r/>
+            <w:r>
+              <w:rPr>
+                <w:rFonts w:ascii="Calibri" w:hAnsi="Calibri" w:eastAsia="Calibri"/>
+                <w:b w:val="0"/>
+                <w:i w:val="0"/>
+                <w:color w:val="14160F"/>
+                <w:sz w:val="20"/>
+              </w:rPr>
+              <w:t>Jet Ski H1</w:t>
+            </w:r>
+          </w:p>
+        </w:tc>
+        <w:tc>
+          <w:tcPr>
+            <w:tcW w:type="dxa" w:w="2376"/>
+          </w:tcPr>
+          <w:p>
+            <w:r/>
+            <w:r>
+              <w:rPr>
+                <w:rFonts w:ascii="Calibri" w:hAnsi="Calibri" w:eastAsia="Calibri"/>
+                <w:b w:val="0"/>
+                <w:i w:val="0"/>
+                <w:color w:val="14160F"/>
+                <w:sz w:val="20"/>
+              </w:rPr>
+              <w:t>CHG-007. Cannot rank as reviews.</w:t>
+            </w:r>
+          </w:p>
+        </w:tc>
+      </w:tr>
+      <w:tr>
+        <w:tc>
+          <w:tcPr>
+            <w:tcW w:type="dxa" w:w="2376"/>
+          </w:tcPr>
+          <w:p>
+            <w:r/>
+            <w:r>
+              <w:rPr>
+                <w:rFonts w:ascii="Calibri" w:hAnsi="Calibri" w:eastAsia="Calibri"/>
+                <w:b w:val="0"/>
+                <w:i w:val="0"/>
+                <w:color w:val="14160F"/>
+                <w:sz w:val="20"/>
+              </w:rPr>
+              <w:t>Collapsed URLs</w:t>
+            </w:r>
+          </w:p>
+        </w:tc>
+        <w:tc>
+          <w:tcPr>
+            <w:tcW w:type="dxa" w:w="2376"/>
+          </w:tcPr>
+          <w:p>
+            <w:r/>
+            <w:r>
+              <w:rPr>
+                <w:rFonts w:ascii="Calibri" w:hAnsi="Calibri" w:eastAsia="Calibri"/>
+                <w:b w:val="0"/>
+                <w:i w:val="0"/>
+                <w:color w:val="14160F"/>
+                <w:sz w:val="20"/>
+              </w:rPr>
+              <w:t>/yacht-specials/, /miami-yacht-deals/, /miami-yacht-rentals/</w:t>
+            </w:r>
+          </w:p>
+        </w:tc>
+        <w:tc>
+          <w:tcPr>
+            <w:tcW w:type="dxa" w:w="2376"/>
+          </w:tcPr>
+          <w:p>
+            <w:r/>
+            <w:r>
+              <w:rPr>
+                <w:rFonts w:ascii="Calibri" w:hAnsi="Calibri" w:eastAsia="Calibri"/>
+                <w:b w:val="0"/>
+                <w:i w:val="0"/>
+                <w:color w:val="14160F"/>
+                <w:sz w:val="20"/>
+              </w:rPr>
+              <w:t>Resolve to another template</w:t>
+            </w:r>
+          </w:p>
+        </w:tc>
+        <w:tc>
+          <w:tcPr>
+            <w:tcW w:type="dxa" w:w="2376"/>
+          </w:tcPr>
+          <w:p>
+            <w:r/>
+            <w:r>
+              <w:rPr>
+                <w:rFonts w:ascii="Calibri" w:hAnsi="Calibri" w:eastAsia="Calibri"/>
+                <w:b w:val="0"/>
+                <w:i w:val="0"/>
+                <w:color w:val="14160F"/>
+                <w:sz w:val="20"/>
+              </w:rPr>
+              <w:t>CHG-012. Not ranking on their own.</w:t>
+            </w:r>
+          </w:p>
+        </w:tc>
+      </w:tr>
+      <w:tr>
+        <w:tc>
+          <w:tcPr>
+            <w:tcW w:type="dxa" w:w="2376"/>
+          </w:tcPr>
+          <w:p>
+            <w:r/>
+            <w:r>
+              <w:rPr>
+                <w:rFonts w:ascii="Calibri" w:hAnsi="Calibri" w:eastAsia="Calibri"/>
+                <w:b w:val="0"/>
+                <w:i w:val="0"/>
+                <w:color w:val="14160F"/>
+                <w:sz w:val="20"/>
+              </w:rPr>
+              <w:t>Indexed junk</w:t>
+            </w:r>
+          </w:p>
+        </w:tc>
+        <w:tc>
+          <w:tcPr>
+            <w:tcW w:type="dxa" w:w="2376"/>
+          </w:tcPr>
+          <w:p>
+            <w:r/>
+            <w:r>
+              <w:rPr>
+                <w:rFonts w:ascii="Calibri" w:hAnsi="Calibri" w:eastAsia="Calibri"/>
+                <w:b w:val="0"/>
+                <w:i w:val="0"/>
+                <w:color w:val="14160F"/>
+                <w:sz w:val="20"/>
+              </w:rPr>
+              <w:t>/test/, cart, checkout, Elementor leftovers</w:t>
+            </w:r>
+          </w:p>
+        </w:tc>
+        <w:tc>
+          <w:tcPr>
+            <w:tcW w:type="dxa" w:w="2376"/>
+          </w:tcPr>
+          <w:p>
+            <w:r/>
+            <w:r>
+              <w:rPr>
+                <w:rFonts w:ascii="Calibri" w:hAnsi="Calibri" w:eastAsia="Calibri"/>
+                <w:b w:val="0"/>
+                <w:i w:val="0"/>
+                <w:color w:val="14160F"/>
+                <w:sz w:val="20"/>
+              </w:rPr>
+              <w:t>In the sitemap</w:t>
+            </w:r>
+          </w:p>
+        </w:tc>
+        <w:tc>
+          <w:tcPr>
+            <w:tcW w:type="dxa" w:w="2376"/>
+          </w:tcPr>
+          <w:p>
+            <w:r/>
+            <w:r>
+              <w:rPr>
+                <w:rFonts w:ascii="Calibri" w:hAnsi="Calibri" w:eastAsia="Calibri"/>
+                <w:b w:val="0"/>
+                <w:i w:val="0"/>
+                <w:color w:val="14160F"/>
+                <w:sz w:val="20"/>
+              </w:rPr>
+              <w:t>CHG-004. noindex / drop.</w:t>
+            </w:r>
+          </w:p>
+        </w:tc>
+      </w:tr>
+      <w:tr>
+        <w:tc>
+          <w:tcPr>
+            <w:tcW w:type="dxa" w:w="2376"/>
+          </w:tcPr>
+          <w:p>
+            <w:r/>
+            <w:r>
+              <w:rPr>
+                <w:rFonts w:ascii="Calibri" w:hAnsi="Calibri" w:eastAsia="Calibri"/>
+                <w:b w:val="0"/>
+                <w:i w:val="0"/>
+                <w:color w:val="14160F"/>
+                <w:sz w:val="20"/>
+              </w:rPr>
+              <w:t>Inclusions / Fendi price / phones</w:t>
+            </w:r>
+          </w:p>
+        </w:tc>
+        <w:tc>
+          <w:tcPr>
+            <w:tcW w:type="dxa" w:w="2376"/>
+          </w:tcPr>
+          <w:p>
+            <w:r/>
+            <w:r>
+              <w:rPr>
+                <w:rFonts w:ascii="Calibri" w:hAnsi="Calibri" w:eastAsia="Calibri"/>
+                <w:b w:val="0"/>
+                <w:i w:val="0"/>
+                <w:color w:val="14160F"/>
+                <w:sz w:val="20"/>
+              </w:rPr>
+              <w:t>Seen on scrape</w:t>
+            </w:r>
+          </w:p>
+        </w:tc>
+        <w:tc>
+          <w:tcPr>
+            <w:tcW w:type="dxa" w:w="2376"/>
+          </w:tcPr>
+          <w:p>
+            <w:r/>
+            <w:r>
+              <w:rPr>
+                <w:rFonts w:ascii="Calibri" w:hAnsi="Calibri" w:eastAsia="Calibri"/>
+                <w:b w:val="0"/>
+                <w:i w:val="0"/>
+                <w:color w:val="14160F"/>
+                <w:sz w:val="20"/>
+              </w:rPr>
+              <w:t>Operator lock</w:t>
+            </w:r>
+          </w:p>
+        </w:tc>
+        <w:tc>
+          <w:tcPr>
+            <w:tcW w:type="dxa" w:w="2376"/>
+          </w:tcPr>
+          <w:p>
+            <w:r/>
+            <w:r>
+              <w:rPr>
+                <w:rFonts w:ascii="Calibri" w:hAnsi="Calibri" w:eastAsia="Calibri"/>
+                <w:b w:val="0"/>
+                <w:i w:val="0"/>
+                <w:color w:val="14160F"/>
+                <w:sz w:val="20"/>
+              </w:rPr>
+              <w:t>Out of scope. Do not ticket.</w:t>
             </w:r>
           </w:p>
         </w:tc>
@@ -6831,7 +6956,7 @@
           <w:color w:val="14160F"/>
           <w:sz w:val="22"/>
         </w:rPr>
-        <w:t>Almost 1:1 EN/ES URL count (861 / 860) means you cloned the graph, including the problems. hreflang tags on the page sitemap are present. Good. Do not translate junk. When you 301 a duplicate EN hub, 301 its /es/ twin in the same change. Spanish home should follow the new brand roof, not “Alquiler de yates en Miami” as the corporate H1 unless Spanish demand is Miami-only — and even then the brand still needs a roof.</w:t>
+        <w:t>Almost 1:1 EN/ES URL count (861 / 860) means you cloned the graph, including the problems. hreflang tags on the page sitemap are present. Good. Do not translate junk. Spanish home is the Miami homepage twin (“Alquiler de yates en Miami”) — that is correct under the operator lock. When you change an English URL, apply the same action to its /es/ twin in the same deploy. Do not merge ES Panama into ES Miami home.</w:t>
       </w:r>
     </w:p>
     <w:p>
@@ -6891,7 +7016,7 @@
           <w:color w:val="14160F"/>
           <w:sz w:val="22"/>
         </w:rPr>
-        <w:t>Filters (size, pink, free hour, budget) — these are attributes. Keep them on ONE hub.</w:t>
+        <w:t>Filters (size, pink, free hour, budget) — keep them; do not use filters as a reason to 301 hubs.</w:t>
       </w:r>
     </w:p>
     <w:p>
@@ -6907,7 +7032,7 @@
           <w:color w:val="14160F"/>
           <w:sz w:val="22"/>
         </w:rPr>
-        <w:t>Founder attribution and Tripadvisor / review surfaces — after the numbers are reconciled.</w:t>
+        <w:t>Founder attribution and Tripadvisor / review surfaces — wire counts to the shortcode.</w:t>
       </w:r>
     </w:p>
     <w:p>
@@ -6955,7 +7080,7 @@
           <w:color w:val="14160F"/>
           <w:sz w:val="22"/>
         </w:rPr>
-        <w:t>Panama money page structure — copy this discipline to Miami after the merge.</w:t>
+        <w:t>Panama money page structure — keep it; do not fold it into the homepage.</w:t>
       </w:r>
     </w:p>
     <w:p>
@@ -6967,7 +7092,7 @@
           <w:rFonts w:ascii="Calibri" w:hAnsi="Calibri"/>
           <w:color w:val="C49200"/>
         </w:rPr>
-        <w:t>13. Priority queue (no calendar theater)</w:t>
+        <w:t>13. Priority queue (operator-adjusted)</w:t>
       </w:r>
     </w:p>
     <w:p>
@@ -6982,7 +7107,7 @@
           <w:color w:val="14160F"/>
           <w:sz w:val="22"/>
         </w:rPr>
-        <w:t>Tier 0 — trust. Ship before any new blog node.</w:t>
+        <w:t>Tier 0 — junk and shortcodes. Ship before any new blog node.</w:t>
       </w:r>
     </w:p>
     <w:p>
@@ -6998,7 +7123,7 @@
           <w:color w:val="14160F"/>
           <w:sz w:val="22"/>
         </w:rPr>
-        <w:t>One US phone, one Panama phone, one address set. Align site, GBP, Yelp, Facebook, schema.</w:t>
+        <w:t>Noindex tests, cart, checkout, Elementor leftovers (Excel CHG-004).</w:t>
       </w:r>
     </w:p>
     <w:p>
@@ -7014,7 +7139,7 @@
           <w:color w:val="14160F"/>
           <w:sz w:val="22"/>
         </w:rPr>
-        <w:t>One review sentence. Either an audited integer or no integer.</w:t>
+        <w:t>Review shortcode so one edit updates every template (Excel CHG-011). Operator is adding this.</w:t>
       </w:r>
     </w:p>
     <w:p>
@@ -7030,7 +7155,22 @@
           <w:color w:val="14160F"/>
           <w:sz w:val="22"/>
         </w:rPr>
-        <w:t>One inclusions rule. The widget and the H2 cannot disagree.</w:t>
+        <w:t>Leave city phones and hub/listing prices alone.</w:t>
+      </w:r>
+    </w:p>
+    <w:p>
+      <w:pPr>
+        <w:spacing w:after="160" w:before="0" w:line="276" w:lineRule="auto"/>
+      </w:pPr>
+      <w:r>
+        <w:rPr>
+          <w:rFonts w:ascii="Calibri" w:hAnsi="Calibri" w:eastAsia="Calibri"/>
+          <w:b/>
+          <w:i w:val="0"/>
+          <w:color w:val="14160F"/>
+          <w:sz w:val="22"/>
+        </w:rPr>
+        <w:t>Tier 1 — each page/city ranks on its own.</w:t>
       </w:r>
     </w:p>
     <w:p>
@@ -7046,7 +7186,7 @@
           <w:color w:val="14160F"/>
           <w:sz w:val="22"/>
         </w:rPr>
-        <w:t>Noindex tests, cart, checkout, Elementor leftovers, /l00-person…</w:t>
+        <w:t>Homepage stays the Miami ranker. Panama hub stays the Panama ranker.</w:t>
       </w:r>
     </w:p>
     <w:p>
@@ -7062,22 +7202,7 @@
           <w:color w:val="14160F"/>
           <w:sz w:val="22"/>
         </w:rPr>
-        <w:t>Lock listing capacity and price to ops truth (Fendi is the exhibit).</w:t>
-      </w:r>
-    </w:p>
-    <w:p>
-      <w:pPr>
-        <w:spacing w:after="160" w:before="0" w:line="276" w:lineRule="auto"/>
-      </w:pPr>
-      <w:r>
-        <w:rPr>
-          <w:rFonts w:ascii="Calibri" w:hAnsi="Calibri" w:eastAsia="Calibri"/>
-          <w:b/>
-          <w:i w:val="0"/>
-          <w:color w:val="14160F"/>
-          <w:sz w:val="22"/>
-        </w:rPr>
-        <w:t>Tier 1 — ownership.</w:t>
+        <w:t>Do not 301 Miami hubs together. Give each URL a unique H1/first passage for its query.</w:t>
       </w:r>
     </w:p>
     <w:p>
@@ -7093,7 +7218,7 @@
           <w:color w:val="14160F"/>
           <w:sz w:val="22"/>
         </w:rPr>
-        <w:t>Write the query → URL table. Approve it. Then 301.</w:t>
+        <w:t>Un-collapse /yacht-specials/, /miami-yacht-deals/, /miami-yacht-rentals/ or accept them as aliases (CHG-012).</w:t>
       </w:r>
     </w:p>
     <w:p>
@@ -7109,55 +7234,7 @@
           <w:color w:val="14160F"/>
           <w:sz w:val="22"/>
         </w:rPr>
-        <w:t>Homepage becomes brand + Miami + Panama. Miami H1 moves off /.</w:t>
-      </w:r>
-    </w:p>
-    <w:p>
-      <w:pPr>
-        <w:pStyle w:val="ListBullet"/>
-        <w:spacing w:after="80"/>
-      </w:pPr>
-      <w:r>
-        <w:rPr>
-          <w:rFonts w:ascii="Calibri" w:hAnsi="Calibri" w:eastAsia="Calibri"/>
-          <w:b w:val="0"/>
-          <w:i w:val="0"/>
-          <w:color w:val="14160F"/>
-          <w:sz w:val="22"/>
-        </w:rPr>
-        <w:t>Merge /miami-yacht-charters/ into /miami-yacht-rental/ (or the reverse — pick one slug and stop).</w:t>
-      </w:r>
-    </w:p>
-    <w:p>
-      <w:pPr>
-        <w:pStyle w:val="ListBullet"/>
-        <w:spacing w:after="80"/>
-      </w:pPr>
-      <w:r>
-        <w:rPr>
-          <w:rFonts w:ascii="Calibri" w:hAnsi="Calibri" w:eastAsia="Calibri"/>
-          <w:b w:val="0"/>
-          <w:i w:val="0"/>
-          <w:color w:val="14160F"/>
-          <w:sz w:val="22"/>
-        </w:rPr>
-        <w:t>Merge cheap/affordable. Rewrite Fort Lauderdale or demote it.</w:t>
-      </w:r>
-    </w:p>
-    <w:p>
-      <w:pPr>
-        <w:pStyle w:val="ListBullet"/>
-        <w:spacing w:after="80"/>
-      </w:pPr>
-      <w:r>
-        <w:rPr>
-          <w:rFonts w:ascii="Calibri" w:hAnsi="Calibri" w:eastAsia="Calibri"/>
-          <w:b w:val="0"/>
-          <w:i w:val="0"/>
-          <w:color w:val="14160F"/>
-          <w:sz w:val="22"/>
-        </w:rPr>
-        <w:t>One canonical per vessel. Kill cheapest-folder and CPT copies.</w:t>
+        <w:t>Fix wrong-entity slugs so they can rank for themselves: FTL≠North Miami, destinations≠list-your-boat, panama-sales≠Miami rental, reviews≠jet ski, /l00-person/ typo (CHG-007).</w:t>
       </w:r>
     </w:p>
     <w:p>
@@ -7188,7 +7265,7 @@
           <w:color w:val="14160F"/>
           <w:sz w:val="22"/>
         </w:rPr>
-        <w:t>Freeze auto-blog until topics are on the map.</w:t>
+        <w:t>Keep/upgrade tips that help a city/page rank (birthday-itinerary bar). Prune TEST and thin automation posts.</w:t>
       </w:r>
     </w:p>
     <w:p>
@@ -7204,7 +7281,7 @@
           <w:color w:val="14160F"/>
           <w:sz w:val="22"/>
         </w:rPr>
-        <w:t>Keep/upgrade tips that pass the birthday-itinerary bar. Prune the rest.</w:t>
+        <w:t>Move Panama vessels out of /fleet/miami-catering/.</w:t>
       </w:r>
     </w:p>
     <w:p>
@@ -7220,7 +7297,7 @@
           <w:color w:val="14160F"/>
           <w:sz w:val="22"/>
         </w:rPr>
-        <w:t>Occasion hubs with different H1s than the Miami head term.</w:t>
+        <w:t>Fix orphan /miami-yacht-rental/{boat}/ links that are not in the sitemap.</w:t>
       </w:r>
     </w:p>
     <w:p>
@@ -7251,7 +7328,7 @@
           <w:color w:val="14160F"/>
           <w:sz w:val="22"/>
         </w:rPr>
-        <w:t>Only after ownership is clean: deepen Miami EAV (inclusions matrix, departure marinas, occasion FAQs) on the single owner.</w:t>
+        <w:t>Deepen unique facts on each ranking URL (not a single merged owner).</w:t>
       </w:r>
     </w:p>
     <w:p>
@@ -7267,7 +7344,7 @@
           <w:color w:val="14160F"/>
           <w:sz w:val="22"/>
         </w:rPr>
-        <w:t>Mirror Panama’s route-style clarity onto Miami itineraries (sandbar vs skyline vs Key Biscayne) as attributes, not new money URLs.</w:t>
+        <w:t>Spanish twin follows the English page it translates. Do not merge ES Panama into ES Miami home.</w:t>
       </w:r>
     </w:p>
     <w:p>
@@ -7295,7 +7372,7 @@
           <w:color w:val="14160F"/>
           <w:sz w:val="22"/>
         </w:rPr>
-        <w:t>Canonical US and Panama phone + WhatsApp + booking hours.</w:t>
+        <w:t>Which review integer the shortcode should print, and which platforms it includes.</w:t>
       </w:r>
     </w:p>
     <w:p>
@@ -7311,7 +7388,7 @@
           <w:color w:val="14160F"/>
           <w:sz w:val="22"/>
         </w:rPr>
-        <w:t>Legal passenger caps per vessel; who may exceed 13 and on which boats.</w:t>
+        <w:t>Whether Fort Lauderdale / Haulover is meant to rank as its own city (if yes, the H1/body must stay FTL).</w:t>
       </w:r>
     </w:p>
     <w:p>
@@ -7327,7 +7404,7 @@
           <w:color w:val="14160F"/>
           <w:sz w:val="22"/>
         </w:rPr>
-        <w:t>What “included” means: captain, crew, fuel, ice, dock fees, gratuity.</w:t>
+        <w:t>Whether Panama yacht sales is a real sold line (live page is Miami rental copy).</w:t>
       </w:r>
     </w:p>
     <w:p>
@@ -7343,55 +7420,7 @@
           <w:color w:val="14160F"/>
           <w:sz w:val="22"/>
         </w:rPr>
-        <w:t>How many unique bookable vessels exist this week in Miami vs Panama — not “400+” until defined.</w:t>
-      </w:r>
-    </w:p>
-    <w:p>
-      <w:pPr>
-        <w:pStyle w:val="ListBullet"/>
-        <w:spacing w:after="80"/>
-      </w:pPr>
-      <w:r>
-        <w:rPr>
-          <w:rFonts w:ascii="Calibri" w:hAnsi="Calibri" w:eastAsia="Calibri"/>
-          <w:b w:val="0"/>
-          <w:i w:val="0"/>
-          <w:color w:val="14160F"/>
-          <w:sz w:val="22"/>
-        </w:rPr>
-        <w:t>Which review integer you will stand behind, and which platforms it includes.</w:t>
-      </w:r>
-    </w:p>
-    <w:p>
-      <w:pPr>
-        <w:pStyle w:val="ListBullet"/>
-        <w:spacing w:after="80"/>
-      </w:pPr>
-      <w:r>
-        <w:rPr>
-          <w:rFonts w:ascii="Calibri" w:hAnsi="Calibri" w:eastAsia="Calibri"/>
-          <w:b w:val="0"/>
-          <w:i w:val="0"/>
-          <w:color w:val="14160F"/>
-          <w:sz w:val="22"/>
-        </w:rPr>
-        <w:t>Whether Fort Lauderdale / Haulover is a real departure product or a Miami-area alias.</w:t>
-      </w:r>
-    </w:p>
-    <w:p>
-      <w:pPr>
-        <w:pStyle w:val="ListBullet"/>
-        <w:spacing w:after="80"/>
-      </w:pPr>
-      <w:r>
-        <w:rPr>
-          <w:rFonts w:ascii="Calibri" w:hAnsi="Calibri" w:eastAsia="Calibri"/>
-          <w:b w:val="0"/>
-          <w:i w:val="0"/>
-          <w:color w:val="14160F"/>
-          <w:sz w:val="22"/>
-        </w:rPr>
-        <w:t>Whether Panama yacht maintenance / sales / horseback are real sold lines.</w:t>
+        <w:t>Whether /yacht-specials/ and /miami-yacht-deals/ should become unique rankers or stay aliases.</w:t>
       </w:r>
     </w:p>
     <w:p>
@@ -7434,7 +7463,7 @@
           <w:color w:val="14160F"/>
           <w:sz w:val="22"/>
         </w:rPr>
-        <w:t>Cori’s framework is the right judge for this site, and the site is currently using the wrong half of it. You have coverage. You do not have borders. You have entities (boats, cities, occasions). You do not have one document per entity type. You have historical publishing (tips updated today). You do not have historical consistency (phones, prices, review counts).</w:t>
+        <w:t>Got it. Home is the Miami ranker. Panama already has its own ranking URL. The job is not to merge hubs — it is to make every page and every city able to rank on its own. Phones stay city-specific. Review counts move to shortcodes as you grow. Hub pricing is out of scope.</w:t>
       </w:r>
     </w:p>
     <w:p>
@@ -7449,7 +7478,7 @@
           <w:color w:val="14160F"/>
           <w:sz w:val="22"/>
         </w:rPr>
-        <w:t>If we apply the framework honestly, the next month of SEO work is subtraction and alignment, not another 40 posts. Corey should not get a “write more Miami tips” brief until the ownership table is approved. Pacman should verify the 301s and the NAP pass the way he verifies a meta change: live, not by word count.</w:t>
+        <w:t>The remaining work is subtraction of junk, un-collapsing aliases, and fixing slugs whose live H1 is a different city or entity. Corey stays approval-gated on the Excel CHANGE_QUEUE. Pacman verifies live.</w:t>
       </w:r>
     </w:p>
     <w:p>
@@ -7464,7 +7493,7 @@
           <w:color w:val="14160F"/>
           <w:sz w:val="22"/>
         </w:rPr>
-        <w:t>I can turn §13 into a Corey proposal (map + 301 list + homepage brief) when you want that gated. This document is the audit, not the implementation.</w:t>
+        <w:t>This document is the audit. Approve tickets in the Excel. I will not reopen OP-001 or OP-002.</w:t>
       </w:r>
     </w:p>
     <w:p>
@@ -7476,7 +7505,7 @@
           <w:rFonts w:ascii="Calibri" w:hAnsi="Calibri"/>
           <w:color w:val="C49200"/>
         </w:rPr>
-        <w:t>Appendix A — Recommended owner URLs (draft)</w:t>
+        <w:t>Appendix A — Ranking URLs (operator lock)</w:t>
       </w:r>
     </w:p>
     <w:tbl>
@@ -7525,7 +7554,7 @@
                 <w:color w:val="FFF6D8"/>
                 <w:sz w:val="20"/>
               </w:rPr>
-              <w:t>Owner URL</w:t>
+              <w:t>Ranking URL</w:t>
             </w:r>
           </w:p>
         </w:tc>
@@ -7545,7 +7574,7 @@
                 <w:color w:val="14160F"/>
                 <w:sz w:val="20"/>
               </w:rPr>
-              <w:t>Brand</w:t>
+              <w:t>Miami (homepage ranker)</w:t>
             </w:r>
           </w:p>
         </w:tc>
@@ -7583,7 +7612,7 @@
                 <w:color w:val="14160F"/>
                 <w:sz w:val="20"/>
               </w:rPr>
-              <w:t>Miami charter (head)</w:t>
+              <w:t>Miami rental (own page)</w:t>
             </w:r>
           </w:p>
         </w:tc>
@@ -7621,7 +7650,45 @@
                 <w:color w:val="14160F"/>
                 <w:sz w:val="20"/>
               </w:rPr>
-              <w:t>Panama charter (head)</w:t>
+              <w:t>Miami charters (own page)</w:t>
+            </w:r>
+          </w:p>
+        </w:tc>
+        <w:tc>
+          <w:tcPr>
+            <w:tcW w:type="dxa" w:w="4752"/>
+          </w:tcPr>
+          <w:p>
+            <w:r/>
+            <w:r>
+              <w:rPr>
+                <w:rFonts w:ascii="Calibri" w:hAnsi="Calibri" w:eastAsia="Calibri"/>
+                <w:b w:val="0"/>
+                <w:i w:val="0"/>
+                <w:color w:val="14160F"/>
+                <w:sz w:val="20"/>
+              </w:rPr>
+              <w:t>https://feelingyachty.com/miami-yacht-charters/</w:t>
+            </w:r>
+          </w:p>
+        </w:tc>
+      </w:tr>
+      <w:tr>
+        <w:tc>
+          <w:tcPr>
+            <w:tcW w:type="dxa" w:w="4752"/>
+          </w:tcPr>
+          <w:p>
+            <w:r/>
+            <w:r>
+              <w:rPr>
+                <w:rFonts w:ascii="Calibri" w:hAnsi="Calibri" w:eastAsia="Calibri"/>
+                <w:b w:val="0"/>
+                <w:i w:val="0"/>
+                <w:color w:val="14160F"/>
+                <w:sz w:val="20"/>
+              </w:rPr>
+              <w:t>Panama (already ranks)</w:t>
             </w:r>
           </w:p>
         </w:tc>
@@ -7659,7 +7726,7 @@
                 <w:color w:val="14160F"/>
                 <w:sz w:val="20"/>
               </w:rPr>
-              <w:t>Contact / NAP</w:t>
+              <w:t>Contact (city phones OK)</w:t>
             </w:r>
           </w:p>
         </w:tc>
@@ -7735,7 +7802,7 @@
                 <w:color w:val="14160F"/>
                 <w:sz w:val="20"/>
               </w:rPr>
-              <w:t>Reviews</w:t>
+              <w:t>Reviews (fix Jet Ski H1)</w:t>
             </w:r>
           </w:p>
         </w:tc>
@@ -7943,7 +8010,7 @@
                 <w:color w:val="14160F"/>
                 <w:sz w:val="20"/>
               </w:rPr>
-              <w:t>https://feelingyachty.com/book/  (or GHL only — do not let it rank as a money clone)</w:t>
+              <w:t>https://feelingyachty.com/book/  (login — do not let it rank as a money clone)</w:t>
             </w:r>
           </w:p>
         </w:tc>

</xml_diff>